<commit_message>
Estrategias de procesamiento eficiente
</commit_message>
<xml_diff>
--- a/Informe preliminar.docx
+++ b/Informe preliminar.docx
@@ -788,6 +788,909 @@
           <w:sz w:val="24"/>
           <w:szCs w:val="24"/>
         </w:rPr>
+        <w:t>Estrategias de Procesamiento Eficiente</w:t>
+      </w:r>
+      <w:r>
+        <w:rPr>
+          <w:rFonts w:ascii="Times New Roman" w:hAnsi="Times New Roman" w:cs="Times New Roman"/>
+          <w:b/>
+          <w:bCs/>
+          <w:sz w:val="24"/>
+          <w:szCs w:val="24"/>
+        </w:rPr>
+        <w:t>:</w:t>
+      </w:r>
+    </w:p>
+    <w:p>
+      <w:pPr>
+        <w:pStyle w:val="Prrafodelista"/>
+        <w:numPr>
+          <w:ilvl w:val="0"/>
+          <w:numId w:val="10"/>
+        </w:numPr>
+        <w:rPr>
+          <w:rFonts w:ascii="Times New Roman" w:hAnsi="Times New Roman" w:cs="Times New Roman"/>
+          <w:sz w:val="24"/>
+          <w:szCs w:val="24"/>
+        </w:rPr>
+      </w:pPr>
+      <w:r>
+        <w:rPr>
+          <w:rFonts w:ascii="Times New Roman" w:hAnsi="Times New Roman" w:cs="Times New Roman"/>
+          <w:b/>
+          <w:bCs/>
+          <w:sz w:val="24"/>
+          <w:szCs w:val="24"/>
+        </w:rPr>
+        <w:t xml:space="preserve">Manipulación de piezas: </w:t>
+      </w:r>
+      <w:r>
+        <w:rPr>
+          <w:rFonts w:ascii="Times New Roman" w:hAnsi="Times New Roman" w:cs="Times New Roman"/>
+          <w:sz w:val="24"/>
+          <w:szCs w:val="24"/>
+        </w:rPr>
+        <w:t>Para el momento en que se quiera rotar una pieza sería ineficiente mapear toda la estructura, se piensa tener identificadas las coordenadas de la región en la cual está la pieza de inicio y fin (</w:t>
+      </w:r>
+      <w:r>
+        <w:rPr>
+          <w:rFonts w:ascii="Times New Roman" w:hAnsi="Times New Roman" w:cs="Times New Roman"/>
+          <w:sz w:val="24"/>
+          <w:szCs w:val="24"/>
+        </w:rPr>
+        <w:t>tanto horizontales como verticales)</w:t>
+      </w:r>
+      <w:r>
+        <w:rPr>
+          <w:rFonts w:ascii="Times New Roman" w:hAnsi="Times New Roman" w:cs="Times New Roman"/>
+          <w:sz w:val="24"/>
+          <w:szCs w:val="24"/>
+        </w:rPr>
+        <w:t>. Luego a</w:t>
+      </w:r>
+      <w:r>
+        <w:rPr>
+          <w:rFonts w:ascii="Times New Roman" w:hAnsi="Times New Roman" w:cs="Times New Roman"/>
+          <w:sz w:val="24"/>
+          <w:szCs w:val="24"/>
+        </w:rPr>
+        <w:t xml:space="preserve">l solicitar una rotación, se genera una sub-estructura temporal con las nuevas dimensiones y se realiza un </w:t>
+      </w:r>
+      <w:r>
+        <w:rPr>
+          <w:rFonts w:ascii="Times New Roman" w:hAnsi="Times New Roman" w:cs="Times New Roman"/>
+          <w:b/>
+          <w:bCs/>
+          <w:sz w:val="24"/>
+          <w:szCs w:val="24"/>
+        </w:rPr>
+        <w:t>reemplazo directo</w:t>
+      </w:r>
+      <w:r>
+        <w:rPr>
+          <w:rFonts w:ascii="Times New Roman" w:hAnsi="Times New Roman" w:cs="Times New Roman"/>
+          <w:sz w:val="24"/>
+          <w:szCs w:val="24"/>
+        </w:rPr>
+        <w:t xml:space="preserve"> en la sección seleccionada del tablero.</w:t>
+      </w:r>
+    </w:p>
+    <w:p>
+      <w:pPr>
+        <w:pStyle w:val="Prrafodelista"/>
+        <w:rPr>
+          <w:rFonts w:ascii="Times New Roman" w:hAnsi="Times New Roman" w:cs="Times New Roman"/>
+          <w:sz w:val="24"/>
+          <w:szCs w:val="24"/>
+        </w:rPr>
+      </w:pPr>
+    </w:p>
+    <w:p>
+      <w:pPr>
+        <w:pStyle w:val="Prrafodelista"/>
+        <w:numPr>
+          <w:ilvl w:val="0"/>
+          <w:numId w:val="10"/>
+        </w:numPr>
+        <w:rPr>
+          <w:rFonts w:ascii="Times New Roman" w:hAnsi="Times New Roman" w:cs="Times New Roman"/>
+          <w:sz w:val="24"/>
+          <w:szCs w:val="24"/>
+        </w:rPr>
+      </w:pPr>
+      <w:r>
+        <w:rPr>
+          <w:rFonts w:ascii="Times New Roman" w:hAnsi="Times New Roman" w:cs="Times New Roman"/>
+          <w:b/>
+          <w:bCs/>
+          <w:sz w:val="24"/>
+          <w:szCs w:val="24"/>
+        </w:rPr>
+        <w:t>Extensión del tablero:</w:t>
+      </w:r>
+      <w:r>
+        <w:rPr>
+          <w:rFonts w:ascii="Times New Roman" w:hAnsi="Times New Roman" w:cs="Times New Roman"/>
+          <w:sz w:val="24"/>
+          <w:szCs w:val="24"/>
+        </w:rPr>
+        <w:t xml:space="preserve"> El ingreso de una pieza al tablero debe ser </w:t>
+      </w:r>
+      <w:r>
+        <w:rPr>
+          <w:rFonts w:ascii="Times New Roman" w:hAnsi="Times New Roman" w:cs="Times New Roman"/>
+          <w:sz w:val="24"/>
+          <w:szCs w:val="24"/>
+        </w:rPr>
+        <w:t>fila por fila</w:t>
+      </w:r>
+      <w:r>
+        <w:rPr>
+          <w:rFonts w:ascii="Times New Roman" w:hAnsi="Times New Roman" w:cs="Times New Roman"/>
+          <w:sz w:val="24"/>
+          <w:szCs w:val="24"/>
+        </w:rPr>
+        <w:t>, es decir no puede aparecer instantáneamente toda la pieza, pero esto implica una iteración en el acceso a la memoria, por esa razón se piensa añadir un espacio inicial que no se mostrará al usuario para que la pieza aparezca instantáneamente y que solo una vez se requiera revisar la memoria.</w:t>
+      </w:r>
+    </w:p>
+    <w:p>
+      <w:pPr>
+        <w:rPr>
+          <w:rFonts w:ascii="Times New Roman" w:hAnsi="Times New Roman" w:cs="Times New Roman"/>
+          <w:sz w:val="24"/>
+          <w:szCs w:val="24"/>
+        </w:rPr>
+      </w:pPr>
+      <w:r>
+        <w:rPr>
+          <w:rFonts w:ascii="Times New Roman" w:hAnsi="Times New Roman" w:cs="Times New Roman"/>
+          <w:noProof/>
+          <w:sz w:val="24"/>
+          <w:szCs w:val="24"/>
+        </w:rPr>
+        <mc:AlternateContent>
+          <mc:Choice Requires="wpg">
+            <w:drawing>
+              <wp:anchor distT="0" distB="0" distL="114300" distR="114300" simplePos="0" relativeHeight="251660288" behindDoc="0" locked="0" layoutInCell="1" allowOverlap="1" wp14:anchorId="74286BE6" wp14:editId="4DC0485F">
+                <wp:simplePos x="0" y="0"/>
+                <wp:positionH relativeFrom="column">
+                  <wp:posOffset>3426252</wp:posOffset>
+                </wp:positionH>
+                <wp:positionV relativeFrom="paragraph">
+                  <wp:posOffset>74226</wp:posOffset>
+                </wp:positionV>
+                <wp:extent cx="1800000" cy="1963019"/>
+                <wp:effectExtent l="0" t="0" r="10160" b="18415"/>
+                <wp:wrapNone/>
+                <wp:docPr id="946531523" name="Grupo 6"/>
+                <wp:cNvGraphicFramePr/>
+                <a:graphic xmlns:a="http://schemas.openxmlformats.org/drawingml/2006/main">
+                  <a:graphicData uri="http://schemas.microsoft.com/office/word/2010/wordprocessingGroup">
+                    <wpg:wgp>
+                      <wpg:cNvGrpSpPr/>
+                      <wpg:grpSpPr>
+                        <a:xfrm>
+                          <a:off x="0" y="0"/>
+                          <a:ext cx="1800000" cy="1963019"/>
+                          <a:chOff x="0" y="0"/>
+                          <a:chExt cx="1800000" cy="1963019"/>
+                        </a:xfrm>
+                      </wpg:grpSpPr>
+                      <wpg:grpSp>
+                        <wpg:cNvPr id="2018456740" name="Grupo 5"/>
+                        <wpg:cNvGrpSpPr/>
+                        <wpg:grpSpPr>
+                          <a:xfrm>
+                            <a:off x="0" y="0"/>
+                            <a:ext cx="1800000" cy="1963019"/>
+                            <a:chOff x="0" y="0"/>
+                            <a:chExt cx="1800000" cy="1963019"/>
+                          </a:xfrm>
+                        </wpg:grpSpPr>
+                        <wps:wsp>
+                          <wps:cNvPr id="561295970" name="Rectángulo 1"/>
+                          <wps:cNvSpPr/>
+                          <wps:spPr>
+                            <a:xfrm>
+                              <a:off x="0" y="582627"/>
+                              <a:ext cx="1800000" cy="1380392"/>
+                            </a:xfrm>
+                            <a:prstGeom prst="rect">
+                              <a:avLst/>
+                            </a:prstGeom>
+                          </wps:spPr>
+                          <wps:style>
+                            <a:lnRef idx="2">
+                              <a:schemeClr val="accent1">
+                                <a:shade val="15000"/>
+                              </a:schemeClr>
+                            </a:lnRef>
+                            <a:fillRef idx="1">
+                              <a:schemeClr val="accent1"/>
+                            </a:fillRef>
+                            <a:effectRef idx="0">
+                              <a:schemeClr val="accent1"/>
+                            </a:effectRef>
+                            <a:fontRef idx="minor">
+                              <a:schemeClr val="lt1"/>
+                            </a:fontRef>
+                          </wps:style>
+                          <wps:txbx>
+                            <w:txbxContent>
+                              <w:p>
+                                <w:pPr>
+                                  <w:jc w:val="center"/>
+                                  <w:rPr>
+                                    <w:rFonts w:ascii="Times New Roman" w:hAnsi="Times New Roman" w:cs="Times New Roman"/>
+                                    <w:b/>
+                                    <w:bCs/>
+                                    <w:sz w:val="28"/>
+                                    <w:szCs w:val="28"/>
+                                  </w:rPr>
+                                </w:pPr>
+                              </w:p>
+                              <w:p>
+                                <w:pPr>
+                                  <w:jc w:val="center"/>
+                                </w:pPr>
+                                <w:r>
+                                  <w:rPr>
+                                    <w:rFonts w:ascii="Times New Roman" w:hAnsi="Times New Roman" w:cs="Times New Roman"/>
+                                    <w:b/>
+                                    <w:bCs/>
+                                    <w:sz w:val="28"/>
+                                    <w:szCs w:val="28"/>
+                                  </w:rPr>
+                                  <w:t>Estructura que se manejará</w:t>
+                                </w:r>
+                              </w:p>
+                            </w:txbxContent>
+                          </wps:txbx>
+                          <wps:bodyPr rot="0" spcFirstLastPara="0" vertOverflow="overflow" horzOverflow="overflow" vert="horz" wrap="square" lIns="91440" tIns="45720" rIns="91440" bIns="45720" numCol="1" spcCol="0" rtlCol="0" fromWordArt="0" anchor="ctr" anchorCtr="0" forceAA="0" compatLnSpc="1">
+                            <a:prstTxWarp prst="textNoShape">
+                              <a:avLst/>
+                            </a:prstTxWarp>
+                            <a:noAutofit/>
+                          </wps:bodyPr>
+                        </wps:wsp>
+                        <wps:wsp>
+                          <wps:cNvPr id="1800014749" name="Rectángulo 1"/>
+                          <wps:cNvSpPr/>
+                          <wps:spPr>
+                            <a:xfrm>
+                              <a:off x="0" y="0"/>
+                              <a:ext cx="1800000" cy="579755"/>
+                            </a:xfrm>
+                            <a:prstGeom prst="rect">
+                              <a:avLst/>
+                            </a:prstGeom>
+                          </wps:spPr>
+                          <wps:style>
+                            <a:lnRef idx="1">
+                              <a:schemeClr val="accent1"/>
+                            </a:lnRef>
+                            <a:fillRef idx="2">
+                              <a:schemeClr val="accent1"/>
+                            </a:fillRef>
+                            <a:effectRef idx="1">
+                              <a:schemeClr val="accent1"/>
+                            </a:effectRef>
+                            <a:fontRef idx="minor">
+                              <a:schemeClr val="dk1"/>
+                            </a:fontRef>
+                          </wps:style>
+                          <wps:bodyPr rot="0" spcFirstLastPara="0" vertOverflow="overflow" horzOverflow="overflow" vert="horz" wrap="square" lIns="91440" tIns="45720" rIns="91440" bIns="45720" numCol="1" spcCol="0" rtlCol="0" fromWordArt="0" anchor="ctr" anchorCtr="0" forceAA="0" compatLnSpc="1">
+                            <a:prstTxWarp prst="textNoShape">
+                              <a:avLst/>
+                            </a:prstTxWarp>
+                            <a:noAutofit/>
+                          </wps:bodyPr>
+                        </wps:wsp>
+                      </wpg:grpSp>
+                      <wpg:grpSp>
+                        <wpg:cNvPr id="1853323347" name="Grupo 4"/>
+                        <wpg:cNvGrpSpPr/>
+                        <wpg:grpSpPr>
+                          <a:xfrm>
+                            <a:off x="671639" y="121381"/>
+                            <a:ext cx="412694" cy="299405"/>
+                            <a:chOff x="0" y="0"/>
+                            <a:chExt cx="333136" cy="222300"/>
+                          </a:xfrm>
+                        </wpg:grpSpPr>
+                        <wpg:grpSp>
+                          <wpg:cNvPr id="291435573" name="Grupo 3"/>
+                          <wpg:cNvGrpSpPr/>
+                          <wpg:grpSpPr>
+                            <a:xfrm>
+                              <a:off x="0" y="0"/>
+                              <a:ext cx="222250" cy="222250"/>
+                              <a:chOff x="0" y="0"/>
+                              <a:chExt cx="222250" cy="222250"/>
+                            </a:xfrm>
+                          </wpg:grpSpPr>
+                          <wps:wsp>
+                            <wps:cNvPr id="1784174572" name="Rectángulo 2"/>
+                            <wps:cNvSpPr/>
+                            <wps:spPr>
+                              <a:xfrm>
+                                <a:off x="0" y="0"/>
+                                <a:ext cx="108000" cy="108000"/>
+                              </a:xfrm>
+                              <a:prstGeom prst="rect">
+                                <a:avLst/>
+                              </a:prstGeom>
+                            </wps:spPr>
+                            <wps:style>
+                              <a:lnRef idx="1">
+                                <a:schemeClr val="dk1"/>
+                              </a:lnRef>
+                              <a:fillRef idx="2">
+                                <a:schemeClr val="dk1"/>
+                              </a:fillRef>
+                              <a:effectRef idx="1">
+                                <a:schemeClr val="dk1"/>
+                              </a:effectRef>
+                              <a:fontRef idx="minor">
+                                <a:schemeClr val="dk1"/>
+                              </a:fontRef>
+                            </wps:style>
+                            <wps:bodyPr rot="0" spcFirstLastPara="0" vertOverflow="overflow" horzOverflow="overflow" vert="horz" wrap="square" lIns="91440" tIns="45720" rIns="91440" bIns="45720" numCol="1" spcCol="0" rtlCol="0" fromWordArt="0" anchor="ctr" anchorCtr="0" forceAA="0" compatLnSpc="1">
+                              <a:prstTxWarp prst="textNoShape">
+                                <a:avLst/>
+                              </a:prstTxWarp>
+                              <a:noAutofit/>
+                            </wps:bodyPr>
+                          </wps:wsp>
+                          <wps:wsp>
+                            <wps:cNvPr id="316530316" name="Rectángulo 2"/>
+                            <wps:cNvSpPr/>
+                            <wps:spPr>
+                              <a:xfrm>
+                                <a:off x="114300" y="0"/>
+                                <a:ext cx="107950" cy="107950"/>
+                              </a:xfrm>
+                              <a:prstGeom prst="rect">
+                                <a:avLst/>
+                              </a:prstGeom>
+                            </wps:spPr>
+                            <wps:style>
+                              <a:lnRef idx="1">
+                                <a:schemeClr val="dk1"/>
+                              </a:lnRef>
+                              <a:fillRef idx="2">
+                                <a:schemeClr val="dk1"/>
+                              </a:fillRef>
+                              <a:effectRef idx="1">
+                                <a:schemeClr val="dk1"/>
+                              </a:effectRef>
+                              <a:fontRef idx="minor">
+                                <a:schemeClr val="dk1"/>
+                              </a:fontRef>
+                            </wps:style>
+                            <wps:bodyPr rot="0" spcFirstLastPara="0" vertOverflow="overflow" horzOverflow="overflow" vert="horz" wrap="square" lIns="91440" tIns="45720" rIns="91440" bIns="45720" numCol="1" spcCol="0" rtlCol="0" fromWordArt="0" anchor="ctr" anchorCtr="0" forceAA="0" compatLnSpc="1">
+                              <a:prstTxWarp prst="textNoShape">
+                                <a:avLst/>
+                              </a:prstTxWarp>
+                              <a:noAutofit/>
+                            </wps:bodyPr>
+                          </wps:wsp>
+                          <wps:wsp>
+                            <wps:cNvPr id="979756655" name="Rectángulo 2"/>
+                            <wps:cNvSpPr/>
+                            <wps:spPr>
+                              <a:xfrm>
+                                <a:off x="114300" y="114300"/>
+                                <a:ext cx="107950" cy="107950"/>
+                              </a:xfrm>
+                              <a:prstGeom prst="rect">
+                                <a:avLst/>
+                              </a:prstGeom>
+                            </wps:spPr>
+                            <wps:style>
+                              <a:lnRef idx="1">
+                                <a:schemeClr val="dk1"/>
+                              </a:lnRef>
+                              <a:fillRef idx="2">
+                                <a:schemeClr val="dk1"/>
+                              </a:fillRef>
+                              <a:effectRef idx="1">
+                                <a:schemeClr val="dk1"/>
+                              </a:effectRef>
+                              <a:fontRef idx="minor">
+                                <a:schemeClr val="dk1"/>
+                              </a:fontRef>
+                            </wps:style>
+                            <wps:bodyPr rot="0" spcFirstLastPara="0" vertOverflow="overflow" horzOverflow="overflow" vert="horz" wrap="square" lIns="91440" tIns="45720" rIns="91440" bIns="45720" numCol="1" spcCol="0" rtlCol="0" fromWordArt="0" anchor="ctr" anchorCtr="0" forceAA="0" compatLnSpc="1">
+                              <a:prstTxWarp prst="textNoShape">
+                                <a:avLst/>
+                              </a:prstTxWarp>
+                              <a:noAutofit/>
+                            </wps:bodyPr>
+                          </wps:wsp>
+                        </wpg:grpSp>
+                        <wps:wsp>
+                          <wps:cNvPr id="983951838" name="Rectángulo 2"/>
+                          <wps:cNvSpPr/>
+                          <wps:spPr>
+                            <a:xfrm>
+                              <a:off x="225136" y="114300"/>
+                              <a:ext cx="108000" cy="108000"/>
+                            </a:xfrm>
+                            <a:prstGeom prst="rect">
+                              <a:avLst/>
+                            </a:prstGeom>
+                          </wps:spPr>
+                          <wps:style>
+                            <a:lnRef idx="1">
+                              <a:schemeClr val="dk1"/>
+                            </a:lnRef>
+                            <a:fillRef idx="2">
+                              <a:schemeClr val="dk1"/>
+                            </a:fillRef>
+                            <a:effectRef idx="1">
+                              <a:schemeClr val="dk1"/>
+                            </a:effectRef>
+                            <a:fontRef idx="minor">
+                              <a:schemeClr val="dk1"/>
+                            </a:fontRef>
+                          </wps:style>
+                          <wps:bodyPr rot="0" spcFirstLastPara="0" vertOverflow="overflow" horzOverflow="overflow" vert="horz" wrap="square" lIns="91440" tIns="45720" rIns="91440" bIns="45720" numCol="1" spcCol="0" rtlCol="0" fromWordArt="0" anchor="ctr" anchorCtr="0" forceAA="0" compatLnSpc="1">
+                            <a:prstTxWarp prst="textNoShape">
+                              <a:avLst/>
+                            </a:prstTxWarp>
+                            <a:noAutofit/>
+                          </wps:bodyPr>
+                        </wps:wsp>
+                      </wpg:grpSp>
+                    </wpg:wgp>
+                  </a:graphicData>
+                </a:graphic>
+                <wp14:sizeRelH relativeFrom="margin">
+                  <wp14:pctWidth>0</wp14:pctWidth>
+                </wp14:sizeRelH>
+                <wp14:sizeRelV relativeFrom="margin">
+                  <wp14:pctHeight>0</wp14:pctHeight>
+                </wp14:sizeRelV>
+              </wp:anchor>
+            </w:drawing>
+          </mc:Choice>
+          <mc:Fallback>
+            <w:pict>
+              <v:group w14:anchorId="74286BE6" id="Grupo 6" o:spid="_x0000_s1026" style="position:absolute;margin-left:269.8pt;margin-top:5.85pt;width:141.75pt;height:154.55pt;z-index:251660288;mso-width-relative:margin;mso-height-relative:margin" coordsize="18000,19630" o:gfxdata="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">
+                <v:group id="Grupo 5" o:spid="_x0000_s1027" style="position:absolute;width:18000;height:19630" coordsize="18000,19630" o:gfxdata="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">
+                  <v:rect id="_x0000_s1028" style="position:absolute;top:5826;width:18000;height:13804;visibility:visible;mso-wrap-style:square;v-text-anchor:middle" o:gfxdata="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" fillcolor="#156082 [3204]" strokecolor="#030e13 [484]" strokeweight="1pt">
+                    <v:textbox>
+                      <w:txbxContent>
+                        <w:p>
+                          <w:pPr>
+                            <w:jc w:val="center"/>
+                            <w:rPr>
+                              <w:rFonts w:ascii="Times New Roman" w:hAnsi="Times New Roman" w:cs="Times New Roman"/>
+                              <w:b/>
+                              <w:bCs/>
+                              <w:sz w:val="28"/>
+                              <w:szCs w:val="28"/>
+                            </w:rPr>
+                          </w:pPr>
+                        </w:p>
+                        <w:p>
+                          <w:pPr>
+                            <w:jc w:val="center"/>
+                          </w:pPr>
+                          <w:r>
+                            <w:rPr>
+                              <w:rFonts w:ascii="Times New Roman" w:hAnsi="Times New Roman" w:cs="Times New Roman"/>
+                              <w:b/>
+                              <w:bCs/>
+                              <w:sz w:val="28"/>
+                              <w:szCs w:val="28"/>
+                            </w:rPr>
+                            <w:t>Estructura que se manejará</w:t>
+                          </w:r>
+                        </w:p>
+                      </w:txbxContent>
+                    </v:textbox>
+                  </v:rect>
+                  <v:rect id="_x0000_s1029" style="position:absolute;width:18000;height:5797;visibility:visible;mso-wrap-style:square;v-text-anchor:middle" o:gfxdata="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" fillcolor="#30a7dd [2164]" strokecolor="#156082 [3204]" strokeweight=".5pt">
+                    <v:fill color2="#1e8bbd [2612]" rotate="t" colors="0 #9cafbf;.5 #8fa3b4;1 #7a95ab" focus="100%" type="gradient">
+                      <o:fill v:ext="view" type="gradientUnscaled"/>
+                    </v:fill>
+                  </v:rect>
+                </v:group>
+                <v:group id="Grupo 4" o:spid="_x0000_s1030" style="position:absolute;left:6716;top:1213;width:4127;height:2994" coordsize="333136,222300" o:gfxdata="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">
+                  <v:group id="Grupo 3" o:spid="_x0000_s1031" style="position:absolute;width:222250;height:222250" coordsize="222250,222250" o:gfxdata="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">
+                    <v:rect id="Rectángulo 2" o:spid="_x0000_s1032" style="position:absolute;width:108000;height:108000;visibility:visible;mso-wrap-style:square;v-text-anchor:middle" o:gfxdata="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" fillcolor="#555 [2160]" strokecolor="black [3200]" strokeweight=".5pt">
+                      <v:fill color2="#313131 [2608]" rotate="t" colors="0 #9b9b9b;.5 #8e8e8e;1 #797979" focus="100%" type="gradient">
+                        <o:fill v:ext="view" type="gradientUnscaled"/>
+                      </v:fill>
+                    </v:rect>
+                    <v:rect id="Rectángulo 2" o:spid="_x0000_s1033" style="position:absolute;left:114300;width:107950;height:107950;visibility:visible;mso-wrap-style:square;v-text-anchor:middle" o:gfxdata="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" fillcolor="#555 [2160]" strokecolor="black [3200]" strokeweight=".5pt">
+                      <v:fill color2="#313131 [2608]" rotate="t" colors="0 #9b9b9b;.5 #8e8e8e;1 #797979" focus="100%" type="gradient">
+                        <o:fill v:ext="view" type="gradientUnscaled"/>
+                      </v:fill>
+                    </v:rect>
+                    <v:rect id="Rectángulo 2" o:spid="_x0000_s1034" style="position:absolute;left:114300;top:114300;width:107950;height:107950;visibility:visible;mso-wrap-style:square;v-text-anchor:middle" o:gfxdata="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" fillcolor="#555 [2160]" strokecolor="black [3200]" strokeweight=".5pt">
+                      <v:fill color2="#313131 [2608]" rotate="t" colors="0 #9b9b9b;.5 #8e8e8e;1 #797979" focus="100%" type="gradient">
+                        <o:fill v:ext="view" type="gradientUnscaled"/>
+                      </v:fill>
+                    </v:rect>
+                  </v:group>
+                  <v:rect id="Rectángulo 2" o:spid="_x0000_s1035" style="position:absolute;left:225136;top:114300;width:108000;height:108000;visibility:visible;mso-wrap-style:square;v-text-anchor:middle" o:gfxdata="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" fillcolor="#555 [2160]" strokecolor="black [3200]" strokeweight=".5pt">
+                    <v:fill color2="#313131 [2608]" rotate="t" colors="0 #9b9b9b;.5 #8e8e8e;1 #797979" focus="100%" type="gradient">
+                      <o:fill v:ext="view" type="gradientUnscaled"/>
+                    </v:fill>
+                  </v:rect>
+                </v:group>
+              </v:group>
+            </w:pict>
+          </mc:Fallback>
+        </mc:AlternateContent>
+      </w:r>
+    </w:p>
+    <w:p>
+      <w:pPr>
+        <w:rPr>
+          <w:rFonts w:ascii="Times New Roman" w:hAnsi="Times New Roman" w:cs="Times New Roman"/>
+          <w:sz w:val="24"/>
+          <w:szCs w:val="24"/>
+        </w:rPr>
+      </w:pPr>
+      <w:r>
+        <w:rPr>
+          <w:rFonts w:ascii="Times New Roman" w:hAnsi="Times New Roman" w:cs="Times New Roman"/>
+          <w:noProof/>
+          <w:sz w:val="24"/>
+          <w:szCs w:val="24"/>
+        </w:rPr>
+        <mc:AlternateContent>
+          <mc:Choice Requires="wps">
+            <w:drawing>
+              <wp:anchor distT="0" distB="0" distL="114300" distR="114300" simplePos="0" relativeHeight="251659264" behindDoc="0" locked="0" layoutInCell="1" allowOverlap="1" wp14:anchorId="64A53B0D" wp14:editId="31D75A0F">
+                <wp:simplePos x="0" y="0"/>
+                <wp:positionH relativeFrom="column">
+                  <wp:posOffset>701686</wp:posOffset>
+                </wp:positionH>
+                <wp:positionV relativeFrom="paragraph">
+                  <wp:posOffset>94846</wp:posOffset>
+                </wp:positionV>
+                <wp:extent cx="1799590" cy="1379855"/>
+                <wp:effectExtent l="0" t="0" r="10160" b="10795"/>
+                <wp:wrapNone/>
+                <wp:docPr id="741481565" name="Rectángulo 1"/>
+                <wp:cNvGraphicFramePr/>
+                <a:graphic xmlns:a="http://schemas.openxmlformats.org/drawingml/2006/main">
+                  <a:graphicData uri="http://schemas.microsoft.com/office/word/2010/wordprocessingShape">
+                    <wps:wsp>
+                      <wps:cNvSpPr/>
+                      <wps:spPr>
+                        <a:xfrm>
+                          <a:off x="0" y="0"/>
+                          <a:ext cx="1799590" cy="1379855"/>
+                        </a:xfrm>
+                        <a:prstGeom prst="rect">
+                          <a:avLst/>
+                        </a:prstGeom>
+                      </wps:spPr>
+                      <wps:style>
+                        <a:lnRef idx="2">
+                          <a:schemeClr val="accent1">
+                            <a:shade val="15000"/>
+                          </a:schemeClr>
+                        </a:lnRef>
+                        <a:fillRef idx="1">
+                          <a:schemeClr val="accent1"/>
+                        </a:fillRef>
+                        <a:effectRef idx="0">
+                          <a:schemeClr val="accent1"/>
+                        </a:effectRef>
+                        <a:fontRef idx="minor">
+                          <a:schemeClr val="lt1"/>
+                        </a:fontRef>
+                      </wps:style>
+                      <wps:txbx>
+                        <w:txbxContent>
+                          <w:p>
+                            <w:pPr>
+                              <w:jc w:val="center"/>
+                              <w:rPr>
+                                <w:rFonts w:ascii="Times New Roman" w:hAnsi="Times New Roman" w:cs="Times New Roman"/>
+                                <w:b/>
+                                <w:bCs/>
+                                <w:sz w:val="28"/>
+                                <w:szCs w:val="28"/>
+                              </w:rPr>
+                            </w:pPr>
+                            <w:r>
+                              <w:rPr>
+                                <w:rFonts w:ascii="Times New Roman" w:hAnsi="Times New Roman" w:cs="Times New Roman"/>
+                                <w:b/>
+                                <w:bCs/>
+                                <w:sz w:val="28"/>
+                                <w:szCs w:val="28"/>
+                              </w:rPr>
+                              <w:t>Tablero que ve el Usuario</w:t>
+                            </w:r>
+                          </w:p>
+                        </w:txbxContent>
+                      </wps:txbx>
+                      <wps:bodyPr rot="0" spcFirstLastPara="0" vertOverflow="overflow" horzOverflow="overflow" vert="horz" wrap="square" lIns="91440" tIns="45720" rIns="91440" bIns="45720" numCol="1" spcCol="0" rtlCol="0" fromWordArt="0" anchor="ctr" anchorCtr="0" forceAA="0" compatLnSpc="1">
+                        <a:prstTxWarp prst="textNoShape">
+                          <a:avLst/>
+                        </a:prstTxWarp>
+                        <a:noAutofit/>
+                      </wps:bodyPr>
+                    </wps:wsp>
+                  </a:graphicData>
+                </a:graphic>
+                <wp14:sizeRelH relativeFrom="margin">
+                  <wp14:pctWidth>0</wp14:pctWidth>
+                </wp14:sizeRelH>
+              </wp:anchor>
+            </w:drawing>
+          </mc:Choice>
+          <mc:Fallback>
+            <w:pict>
+              <v:rect w14:anchorId="64A53B0D" id="Rectángulo 1" o:spid="_x0000_s1036" style="position:absolute;margin-left:55.25pt;margin-top:7.45pt;width:141.7pt;height:108.65pt;z-index:251659264;visibility:visible;mso-wrap-style:square;mso-width-percent:0;mso-wrap-distance-left:9pt;mso-wrap-distance-top:0;mso-wrap-distance-right:9pt;mso-wrap-distance-bottom:0;mso-position-horizontal:absolute;mso-position-horizontal-relative:text;mso-position-vertical:absolute;mso-position-vertical-relative:text;mso-width-percent:0;mso-width-relative:margin;v-text-anchor:middle" o:gfxdata="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" fillcolor="#156082 [3204]" strokecolor="#030e13 [484]" strokeweight="1pt">
+                <v:textbox>
+                  <w:txbxContent>
+                    <w:p>
+                      <w:pPr>
+                        <w:jc w:val="center"/>
+                        <w:rPr>
+                          <w:rFonts w:ascii="Times New Roman" w:hAnsi="Times New Roman" w:cs="Times New Roman"/>
+                          <w:b/>
+                          <w:bCs/>
+                          <w:sz w:val="28"/>
+                          <w:szCs w:val="28"/>
+                        </w:rPr>
+                      </w:pPr>
+                      <w:r>
+                        <w:rPr>
+                          <w:rFonts w:ascii="Times New Roman" w:hAnsi="Times New Roman" w:cs="Times New Roman"/>
+                          <w:b/>
+                          <w:bCs/>
+                          <w:sz w:val="28"/>
+                          <w:szCs w:val="28"/>
+                        </w:rPr>
+                        <w:t>Tablero que ve el Usuario</w:t>
+                      </w:r>
+                    </w:p>
+                  </w:txbxContent>
+                </v:textbox>
+              </v:rect>
+            </w:pict>
+          </mc:Fallback>
+        </mc:AlternateContent>
+      </w:r>
+    </w:p>
+    <w:p>
+      <w:pPr>
+        <w:rPr>
+          <w:rFonts w:ascii="Times New Roman" w:hAnsi="Times New Roman" w:cs="Times New Roman"/>
+          <w:sz w:val="24"/>
+          <w:szCs w:val="24"/>
+        </w:rPr>
+      </w:pPr>
+    </w:p>
+    <w:p>
+      <w:pPr>
+        <w:rPr>
+          <w:rFonts w:ascii="Times New Roman" w:hAnsi="Times New Roman" w:cs="Times New Roman"/>
+          <w:sz w:val="24"/>
+          <w:szCs w:val="24"/>
+        </w:rPr>
+      </w:pPr>
+    </w:p>
+    <w:p>
+      <w:pPr>
+        <w:rPr>
+          <w:rFonts w:ascii="Times New Roman" w:hAnsi="Times New Roman" w:cs="Times New Roman"/>
+          <w:sz w:val="24"/>
+          <w:szCs w:val="24"/>
+        </w:rPr>
+      </w:pPr>
+    </w:p>
+    <w:p>
+      <w:pPr>
+        <w:rPr>
+          <w:rFonts w:ascii="Times New Roman" w:hAnsi="Times New Roman" w:cs="Times New Roman"/>
+          <w:sz w:val="24"/>
+          <w:szCs w:val="24"/>
+        </w:rPr>
+      </w:pPr>
+    </w:p>
+    <w:p>
+      <w:pPr>
+        <w:rPr>
+          <w:rFonts w:ascii="Times New Roman" w:hAnsi="Times New Roman" w:cs="Times New Roman"/>
+          <w:sz w:val="24"/>
+          <w:szCs w:val="24"/>
+        </w:rPr>
+      </w:pPr>
+    </w:p>
+    <w:p>
+      <w:pPr>
+        <w:rPr>
+          <w:rFonts w:ascii="Times New Roman" w:hAnsi="Times New Roman" w:cs="Times New Roman"/>
+          <w:sz w:val="24"/>
+          <w:szCs w:val="24"/>
+        </w:rPr>
+      </w:pPr>
+    </w:p>
+    <w:p>
+      <w:pPr>
+        <w:pStyle w:val="Prrafodelista"/>
+        <w:numPr>
+          <w:ilvl w:val="0"/>
+          <w:numId w:val="10"/>
+        </w:numPr>
+        <w:rPr>
+          <w:rFonts w:ascii="Times New Roman" w:hAnsi="Times New Roman" w:cs="Times New Roman"/>
+          <w:sz w:val="24"/>
+          <w:szCs w:val="24"/>
+        </w:rPr>
+      </w:pPr>
+      <w:r>
+        <w:rPr>
+          <w:rFonts w:ascii="Times New Roman" w:hAnsi="Times New Roman" w:cs="Times New Roman"/>
+          <w:b/>
+          <w:bCs/>
+          <w:sz w:val="24"/>
+          <w:szCs w:val="24"/>
+        </w:rPr>
+        <w:t>Desp</w:t>
+      </w:r>
+      <w:r>
+        <w:rPr>
+          <w:rFonts w:ascii="Times New Roman" w:hAnsi="Times New Roman" w:cs="Times New Roman"/>
+          <w:b/>
+          <w:bCs/>
+          <w:sz w:val="24"/>
+          <w:szCs w:val="24"/>
+        </w:rPr>
+        <w:t xml:space="preserve">lazamiento hacia abajo: </w:t>
+      </w:r>
+      <w:r>
+        <w:rPr>
+          <w:rFonts w:ascii="Times New Roman" w:hAnsi="Times New Roman" w:cs="Times New Roman"/>
+          <w:sz w:val="24"/>
+          <w:szCs w:val="24"/>
+        </w:rPr>
+        <w:t xml:space="preserve">Para gestionar </w:t>
+      </w:r>
+      <w:r>
+        <w:rPr>
+          <w:rFonts w:ascii="Times New Roman" w:hAnsi="Times New Roman" w:cs="Times New Roman"/>
+          <w:sz w:val="24"/>
+          <w:szCs w:val="24"/>
+        </w:rPr>
+        <w:t>la dinámica</w:t>
+      </w:r>
+      <w:r>
+        <w:rPr>
+          <w:rFonts w:ascii="Times New Roman" w:hAnsi="Times New Roman" w:cs="Times New Roman"/>
+          <w:sz w:val="24"/>
+          <w:szCs w:val="24"/>
+        </w:rPr>
+        <w:t xml:space="preserve"> del juego, el ciclo de renderizado del tablero integra una lógica de detección de colisiones y actualización vertical. El proceso se resume en tres etapas clave:</w:t>
+      </w:r>
+    </w:p>
+    <w:p>
+      <w:pPr>
+        <w:pStyle w:val="Prrafodelista"/>
+        <w:numPr>
+          <w:ilvl w:val="1"/>
+          <w:numId w:val="10"/>
+        </w:numPr>
+        <w:rPr>
+          <w:rFonts w:ascii="Times New Roman" w:hAnsi="Times New Roman" w:cs="Times New Roman"/>
+          <w:sz w:val="24"/>
+          <w:szCs w:val="24"/>
+        </w:rPr>
+      </w:pPr>
+      <w:r>
+        <w:rPr>
+          <w:rFonts w:ascii="Times New Roman" w:hAnsi="Times New Roman" w:cs="Times New Roman"/>
+          <w:b/>
+          <w:bCs/>
+          <w:sz w:val="24"/>
+          <w:szCs w:val="24"/>
+        </w:rPr>
+        <w:t>Validación de Movimiento:</w:t>
+      </w:r>
+      <w:r>
+        <w:rPr>
+          <w:rFonts w:ascii="Times New Roman" w:hAnsi="Times New Roman" w:cs="Times New Roman"/>
+          <w:sz w:val="24"/>
+          <w:szCs w:val="24"/>
+        </w:rPr>
+        <w:t xml:space="preserve"> Antes de actualizar la visualización, el sistema consulta una variable de estado que indica si la pieza está en descenso. En este punto, se realiza una verificación de superposición: se compara la fila inferior de la pieza con la fila inmediatamente inferior del tablero.</w:t>
+      </w:r>
+    </w:p>
+    <w:p>
+      <w:pPr>
+        <w:pStyle w:val="Prrafodelista"/>
+        <w:numPr>
+          <w:ilvl w:val="1"/>
+          <w:numId w:val="10"/>
+        </w:numPr>
+        <w:rPr>
+          <w:rFonts w:ascii="Times New Roman" w:hAnsi="Times New Roman" w:cs="Times New Roman"/>
+          <w:sz w:val="24"/>
+          <w:szCs w:val="24"/>
+        </w:rPr>
+      </w:pPr>
+      <w:r>
+        <w:rPr>
+          <w:rFonts w:ascii="Times New Roman" w:hAnsi="Times New Roman" w:cs="Times New Roman"/>
+          <w:b/>
+          <w:bCs/>
+          <w:sz w:val="24"/>
+          <w:szCs w:val="24"/>
+        </w:rPr>
+        <w:t>Desplazamiento Dinámico:</w:t>
+      </w:r>
+      <w:r>
+        <w:rPr>
+          <w:rFonts w:ascii="Times New Roman" w:hAnsi="Times New Roman" w:cs="Times New Roman"/>
+          <w:sz w:val="24"/>
+          <w:szCs w:val="24"/>
+        </w:rPr>
+        <w:t xml:space="preserve"> Si no se detecta colisión, la pieza avanza una posición hacia abajo. Este movimiento se materializa iterando desde la base de la pieza hasta su parte superior, transfiriendo los valores de cada fila a su nueva ubicación (una fila abajo en la memoria).</w:t>
+      </w:r>
+    </w:p>
+    <w:p>
+      <w:pPr>
+        <w:pStyle w:val="Prrafodelista"/>
+        <w:numPr>
+          <w:ilvl w:val="1"/>
+          <w:numId w:val="10"/>
+        </w:numPr>
+        <w:rPr>
+          <w:rFonts w:ascii="Times New Roman" w:hAnsi="Times New Roman" w:cs="Times New Roman"/>
+          <w:sz w:val="24"/>
+          <w:szCs w:val="24"/>
+        </w:rPr>
+      </w:pPr>
+      <w:r>
+        <w:rPr>
+          <w:rFonts w:ascii="Times New Roman" w:hAnsi="Times New Roman" w:cs="Times New Roman"/>
+          <w:b/>
+          <w:bCs/>
+          <w:sz w:val="24"/>
+          <w:szCs w:val="24"/>
+        </w:rPr>
+        <w:lastRenderedPageBreak/>
+        <w:t>Fijación y Relevo:</w:t>
+      </w:r>
+      <w:r>
+        <w:rPr>
+          <w:rFonts w:ascii="Times New Roman" w:hAnsi="Times New Roman" w:cs="Times New Roman"/>
+          <w:sz w:val="24"/>
+          <w:szCs w:val="24"/>
+        </w:rPr>
+        <w:t xml:space="preserve"> Si se detecta un obstáculo o colisión, el movimiento de la pieza actual se detiene y su estructura se integra permanentemente al tablero. Acto seguido, se genera automáticamente una nueva pieza en la zona superior, transfiriendo el control de los movimientos a este nuevo objeto.</w:t>
+      </w:r>
+    </w:p>
+    <w:p>
+      <w:pPr>
+        <w:rPr>
+          <w:rFonts w:ascii="Times New Roman" w:hAnsi="Times New Roman" w:cs="Times New Roman"/>
+          <w:b/>
+          <w:bCs/>
+          <w:sz w:val="24"/>
+          <w:szCs w:val="24"/>
+        </w:rPr>
+      </w:pPr>
+      <w:r>
+        <w:rPr>
+          <w:rFonts w:ascii="Times New Roman" w:hAnsi="Times New Roman" w:cs="Times New Roman"/>
+          <w:b/>
+          <w:bCs/>
+          <w:sz w:val="24"/>
+          <w:szCs w:val="24"/>
+        </w:rPr>
         <w:t>Diseño:</w:t>
       </w:r>
     </w:p>
@@ -967,6 +1870,42 @@
         </w:rPr>
         <w:t>Reglas y lógica de estado</w:t>
       </w:r>
+    </w:p>
+    <w:p>
+      <w:pPr>
+        <w:rPr>
+          <w:rFonts w:ascii="Times New Roman" w:hAnsi="Times New Roman" w:cs="Times New Roman"/>
+          <w:sz w:val="24"/>
+          <w:szCs w:val="24"/>
+        </w:rPr>
+      </w:pPr>
+    </w:p>
+    <w:p>
+      <w:pPr>
+        <w:rPr>
+          <w:rFonts w:ascii="Times New Roman" w:hAnsi="Times New Roman" w:cs="Times New Roman"/>
+          <w:sz w:val="24"/>
+          <w:szCs w:val="24"/>
+        </w:rPr>
+      </w:pPr>
+    </w:p>
+    <w:p>
+      <w:pPr>
+        <w:rPr>
+          <w:rFonts w:ascii="Times New Roman" w:hAnsi="Times New Roman" w:cs="Times New Roman"/>
+          <w:sz w:val="24"/>
+          <w:szCs w:val="24"/>
+        </w:rPr>
+      </w:pPr>
+    </w:p>
+    <w:p>
+      <w:pPr>
+        <w:rPr>
+          <w:rFonts w:ascii="Times New Roman" w:hAnsi="Times New Roman" w:cs="Times New Roman"/>
+          <w:sz w:val="24"/>
+          <w:szCs w:val="24"/>
+        </w:rPr>
+      </w:pPr>
     </w:p>
     <w:sectPr>
       <w:pgSz w:w="12240" w:h="15840"/>
@@ -981,6 +1920,100 @@
 <file path=word/numbering.xml><?xml version="1.0" encoding="utf-8"?>
 <w:numbering xmlns:wpc="http://schemas.microsoft.com/office/word/2010/wordprocessingCanvas" xmlns:cx="http://schemas.microsoft.com/office/drawing/2014/chartex" xmlns:cx1="http://schemas.microsoft.com/office/drawing/2015/9/8/chartex" xmlns:cx2="http://schemas.microsoft.com/office/drawing/2015/10/21/chartex" xmlns:cx3="http://schemas.microsoft.com/office/drawing/2016/5/9/chartex" xmlns:cx4="http://schemas.microsoft.com/office/drawing/2016/5/10/chartex" xmlns:cx5="http://schemas.microsoft.com/office/drawing/2016/5/11/chartex" xmlns:cx6="http://schemas.microsoft.com/office/drawing/2016/5/12/chartex" xmlns:cx7="http://schemas.microsoft.com/office/drawing/2016/5/13/chartex" xmlns:cx8="http://schemas.microsoft.com/office/drawing/2016/5/14/chartex" xmlns:mc="http://schemas.openxmlformats.org/markup-compatibility/2006" xmlns:aink="http://schemas.microsoft.com/office/drawing/2016/ink" xmlns:am3d="http://schemas.microsoft.com/office/drawing/2017/model3d" xmlns:o="urn:schemas-microsoft-com:office:office" xmlns:oel="http://schemas.microsoft.com/office/2019/extlst" xmlns:r="http://schemas.openxmlformats.org/officeDocument/2006/relationships" xmlns:m="http://schemas.openxmlformats.org/officeDocument/2006/math" xmlns:v="urn:schemas-microsoft-com:vml" xmlns:wp14="http://schemas.microsoft.com/office/word/2010/wordprocessingDrawing" xmlns:wp="http://schemas.openxmlformats.org/drawingml/2006/wordprocessingDrawing" xmlns:w10="urn:schemas-microsoft-com:office:word" xmlns:w="http://schemas.openxmlformats.org/wordprocessingml/2006/main" xmlns:w14="http://schemas.microsoft.com/office/word/2010/wordml" xmlns:w15="http://schemas.microsoft.com/office/word/2012/wordml" xmlns:w16cex="http://schemas.microsoft.com/office/word/2018/wordml/cex" xmlns:w16cid="http://schemas.microsoft.com/office/word/2016/wordml/cid" xmlns:w16="http://schemas.microsoft.com/office/word/2018/wordml" xmlns:w16du="http://schemas.microsoft.com/office/word/2023/wordml/word16du" xmlns:w16sdtdh="http://schemas.microsoft.com/office/word/2020/wordml/sdtdatahash" xmlns:w16sdtfl="http://schemas.microsoft.com/office/word/2024/wordml/sdtformatlock" xmlns:w16se="http://schemas.microsoft.com/office/word/2015/wordml/symex" xmlns:wpg="http://schemas.microsoft.com/office/word/2010/wordprocessingGroup" xmlns:wpi="http://schemas.microsoft.com/office/word/2010/wordprocessingInk" xmlns:wne="http://schemas.microsoft.com/office/word/2006/wordml" xmlns:wps="http://schemas.microsoft.com/office/word/2010/wordprocessingShape" mc:Ignorable="w14 w15 w16se w16cid w16 w16cex w16sdtdh w16sdtfl w16du wp14">
   <w:abstractNum w:abstractNumId="0" w15:restartNumberingAfterBreak="0">
+    <w:nsid w:val="113D1652"/>
+    <w:multiLevelType w:val="hybridMultilevel"/>
+    <w:tmpl w:val="681EA520"/>
+    <w:lvl w:ilvl="0" w:tplc="FADE9A4C">
+      <w:start w:val="1"/>
+      <w:numFmt w:val="decimal"/>
+      <w:lvlText w:val="%1."/>
+      <w:lvlJc w:val="left"/>
+      <w:pPr>
+        <w:ind w:left="720" w:hanging="360"/>
+      </w:pPr>
+      <w:rPr>
+        <w:b/>
+        <w:bCs/>
+      </w:rPr>
+    </w:lvl>
+    <w:lvl w:ilvl="1" w:tplc="6C20A110">
+      <w:start w:val="1"/>
+      <w:numFmt w:val="lowerLetter"/>
+      <w:lvlText w:val="%2."/>
+      <w:lvlJc w:val="left"/>
+      <w:pPr>
+        <w:ind w:left="1440" w:hanging="360"/>
+      </w:pPr>
+      <w:rPr>
+        <w:b/>
+        <w:bCs/>
+      </w:rPr>
+    </w:lvl>
+    <w:lvl w:ilvl="2" w:tplc="240A001B" w:tentative="1">
+      <w:start w:val="1"/>
+      <w:numFmt w:val="lowerRoman"/>
+      <w:lvlText w:val="%3."/>
+      <w:lvlJc w:val="right"/>
+      <w:pPr>
+        <w:ind w:left="2160" w:hanging="180"/>
+      </w:pPr>
+    </w:lvl>
+    <w:lvl w:ilvl="3" w:tplc="240A000F" w:tentative="1">
+      <w:start w:val="1"/>
+      <w:numFmt w:val="decimal"/>
+      <w:lvlText w:val="%4."/>
+      <w:lvlJc w:val="left"/>
+      <w:pPr>
+        <w:ind w:left="2880" w:hanging="360"/>
+      </w:pPr>
+    </w:lvl>
+    <w:lvl w:ilvl="4" w:tplc="240A0019" w:tentative="1">
+      <w:start w:val="1"/>
+      <w:numFmt w:val="lowerLetter"/>
+      <w:lvlText w:val="%5."/>
+      <w:lvlJc w:val="left"/>
+      <w:pPr>
+        <w:ind w:left="3600" w:hanging="360"/>
+      </w:pPr>
+    </w:lvl>
+    <w:lvl w:ilvl="5" w:tplc="240A001B" w:tentative="1">
+      <w:start w:val="1"/>
+      <w:numFmt w:val="lowerRoman"/>
+      <w:lvlText w:val="%6."/>
+      <w:lvlJc w:val="right"/>
+      <w:pPr>
+        <w:ind w:left="4320" w:hanging="180"/>
+      </w:pPr>
+    </w:lvl>
+    <w:lvl w:ilvl="6" w:tplc="240A000F" w:tentative="1">
+      <w:start w:val="1"/>
+      <w:numFmt w:val="decimal"/>
+      <w:lvlText w:val="%7."/>
+      <w:lvlJc w:val="left"/>
+      <w:pPr>
+        <w:ind w:left="5040" w:hanging="360"/>
+      </w:pPr>
+    </w:lvl>
+    <w:lvl w:ilvl="7" w:tplc="240A0019" w:tentative="1">
+      <w:start w:val="1"/>
+      <w:numFmt w:val="lowerLetter"/>
+      <w:lvlText w:val="%8."/>
+      <w:lvlJc w:val="left"/>
+      <w:pPr>
+        <w:ind w:left="5760" w:hanging="360"/>
+      </w:pPr>
+    </w:lvl>
+    <w:lvl w:ilvl="8" w:tplc="240A001B" w:tentative="1">
+      <w:start w:val="1"/>
+      <w:numFmt w:val="lowerRoman"/>
+      <w:lvlText w:val="%9."/>
+      <w:lvlJc w:val="right"/>
+      <w:pPr>
+        <w:ind w:left="6480" w:hanging="180"/>
+      </w:pPr>
+    </w:lvl>
+  </w:abstractNum>
+  <w:abstractNum w:abstractNumId="1" w15:restartNumberingAfterBreak="0">
     <w:nsid w:val="16EC059C"/>
     <w:multiLevelType w:val="multilevel"/>
     <w:tmpl w:val="AA10B148"/>
@@ -1093,7 +2126,7 @@
       </w:pPr>
     </w:lvl>
   </w:abstractNum>
-  <w:abstractNum w:abstractNumId="1" w15:restartNumberingAfterBreak="0">
+  <w:abstractNum w:abstractNumId="2" w15:restartNumberingAfterBreak="0">
     <w:nsid w:val="37D525EC"/>
     <w:multiLevelType w:val="hybridMultilevel"/>
     <w:tmpl w:val="27508CA2"/>
@@ -1206,7 +2239,7 @@
       </w:rPr>
     </w:lvl>
   </w:abstractNum>
-  <w:abstractNum w:abstractNumId="2" w15:restartNumberingAfterBreak="0">
+  <w:abstractNum w:abstractNumId="3" w15:restartNumberingAfterBreak="0">
     <w:nsid w:val="522C1698"/>
     <w:multiLevelType w:val="multilevel"/>
     <w:tmpl w:val="F34076E8"/>
@@ -1355,7 +2388,7 @@
       </w:rPr>
     </w:lvl>
   </w:abstractNum>
-  <w:abstractNum w:abstractNumId="3" w15:restartNumberingAfterBreak="0">
+  <w:abstractNum w:abstractNumId="4" w15:restartNumberingAfterBreak="0">
     <w:nsid w:val="5FB03A2E"/>
     <w:multiLevelType w:val="multilevel"/>
     <w:tmpl w:val="58FC387C"/>
@@ -1468,7 +2501,7 @@
       </w:pPr>
     </w:lvl>
   </w:abstractNum>
-  <w:abstractNum w:abstractNumId="4" w15:restartNumberingAfterBreak="0">
+  <w:abstractNum w:abstractNumId="5" w15:restartNumberingAfterBreak="0">
     <w:nsid w:val="66C96874"/>
     <w:multiLevelType w:val="hybridMultilevel"/>
     <w:tmpl w:val="78025718"/>
@@ -1581,7 +2614,120 @@
       </w:rPr>
     </w:lvl>
   </w:abstractNum>
-  <w:abstractNum w:abstractNumId="5" w15:restartNumberingAfterBreak="0">
+  <w:abstractNum w:abstractNumId="6" w15:restartNumberingAfterBreak="0">
+    <w:nsid w:val="73F70A67"/>
+    <w:multiLevelType w:val="hybridMultilevel"/>
+    <w:tmpl w:val="A978EABA"/>
+    <w:lvl w:ilvl="0" w:tplc="240A0001">
+      <w:start w:val="1"/>
+      <w:numFmt w:val="bullet"/>
+      <w:lvlText w:val=""/>
+      <w:lvlJc w:val="left"/>
+      <w:pPr>
+        <w:ind w:left="720" w:hanging="360"/>
+      </w:pPr>
+      <w:rPr>
+        <w:rFonts w:ascii="Symbol" w:hAnsi="Symbol" w:hint="default"/>
+      </w:rPr>
+    </w:lvl>
+    <w:lvl w:ilvl="1" w:tplc="240A0003" w:tentative="1">
+      <w:start w:val="1"/>
+      <w:numFmt w:val="bullet"/>
+      <w:lvlText w:val="o"/>
+      <w:lvlJc w:val="left"/>
+      <w:pPr>
+        <w:ind w:left="1440" w:hanging="360"/>
+      </w:pPr>
+      <w:rPr>
+        <w:rFonts w:ascii="Courier New" w:hAnsi="Courier New" w:cs="Courier New" w:hint="default"/>
+      </w:rPr>
+    </w:lvl>
+    <w:lvl w:ilvl="2" w:tplc="240A0005" w:tentative="1">
+      <w:start w:val="1"/>
+      <w:numFmt w:val="bullet"/>
+      <w:lvlText w:val=""/>
+      <w:lvlJc w:val="left"/>
+      <w:pPr>
+        <w:ind w:left="2160" w:hanging="360"/>
+      </w:pPr>
+      <w:rPr>
+        <w:rFonts w:ascii="Wingdings" w:hAnsi="Wingdings" w:hint="default"/>
+      </w:rPr>
+    </w:lvl>
+    <w:lvl w:ilvl="3" w:tplc="240A0001" w:tentative="1">
+      <w:start w:val="1"/>
+      <w:numFmt w:val="bullet"/>
+      <w:lvlText w:val=""/>
+      <w:lvlJc w:val="left"/>
+      <w:pPr>
+        <w:ind w:left="2880" w:hanging="360"/>
+      </w:pPr>
+      <w:rPr>
+        <w:rFonts w:ascii="Symbol" w:hAnsi="Symbol" w:hint="default"/>
+      </w:rPr>
+    </w:lvl>
+    <w:lvl w:ilvl="4" w:tplc="240A0003" w:tentative="1">
+      <w:start w:val="1"/>
+      <w:numFmt w:val="bullet"/>
+      <w:lvlText w:val="o"/>
+      <w:lvlJc w:val="left"/>
+      <w:pPr>
+        <w:ind w:left="3600" w:hanging="360"/>
+      </w:pPr>
+      <w:rPr>
+        <w:rFonts w:ascii="Courier New" w:hAnsi="Courier New" w:cs="Courier New" w:hint="default"/>
+      </w:rPr>
+    </w:lvl>
+    <w:lvl w:ilvl="5" w:tplc="240A0005" w:tentative="1">
+      <w:start w:val="1"/>
+      <w:numFmt w:val="bullet"/>
+      <w:lvlText w:val=""/>
+      <w:lvlJc w:val="left"/>
+      <w:pPr>
+        <w:ind w:left="4320" w:hanging="360"/>
+      </w:pPr>
+      <w:rPr>
+        <w:rFonts w:ascii="Wingdings" w:hAnsi="Wingdings" w:hint="default"/>
+      </w:rPr>
+    </w:lvl>
+    <w:lvl w:ilvl="6" w:tplc="240A0001" w:tentative="1">
+      <w:start w:val="1"/>
+      <w:numFmt w:val="bullet"/>
+      <w:lvlText w:val=""/>
+      <w:lvlJc w:val="left"/>
+      <w:pPr>
+        <w:ind w:left="5040" w:hanging="360"/>
+      </w:pPr>
+      <w:rPr>
+        <w:rFonts w:ascii="Symbol" w:hAnsi="Symbol" w:hint="default"/>
+      </w:rPr>
+    </w:lvl>
+    <w:lvl w:ilvl="7" w:tplc="240A0003" w:tentative="1">
+      <w:start w:val="1"/>
+      <w:numFmt w:val="bullet"/>
+      <w:lvlText w:val="o"/>
+      <w:lvlJc w:val="left"/>
+      <w:pPr>
+        <w:ind w:left="5760" w:hanging="360"/>
+      </w:pPr>
+      <w:rPr>
+        <w:rFonts w:ascii="Courier New" w:hAnsi="Courier New" w:cs="Courier New" w:hint="default"/>
+      </w:rPr>
+    </w:lvl>
+    <w:lvl w:ilvl="8" w:tplc="240A0005" w:tentative="1">
+      <w:start w:val="1"/>
+      <w:numFmt w:val="bullet"/>
+      <w:lvlText w:val=""/>
+      <w:lvlJc w:val="left"/>
+      <w:pPr>
+        <w:ind w:left="6480" w:hanging="360"/>
+      </w:pPr>
+      <w:rPr>
+        <w:rFonts w:ascii="Wingdings" w:hAnsi="Wingdings" w:hint="default"/>
+      </w:rPr>
+    </w:lvl>
+  </w:abstractNum>
+  <w:abstractNum w:abstractNumId="7" w15:restartNumberingAfterBreak="0">
     <w:nsid w:val="74605330"/>
     <w:multiLevelType w:val="hybridMultilevel"/>
     <w:tmpl w:val="F9FCBE82"/>
@@ -1694,7 +2840,7 @@
       </w:rPr>
     </w:lvl>
   </w:abstractNum>
-  <w:abstractNum w:abstractNumId="6" w15:restartNumberingAfterBreak="0">
+  <w:abstractNum w:abstractNumId="8" w15:restartNumberingAfterBreak="0">
     <w:nsid w:val="75CE3D50"/>
     <w:multiLevelType w:val="hybridMultilevel"/>
     <w:tmpl w:val="E486ACD0"/>
@@ -1807,7 +2953,7 @@
       </w:rPr>
     </w:lvl>
   </w:abstractNum>
-  <w:abstractNum w:abstractNumId="7" w15:restartNumberingAfterBreak="0">
+  <w:abstractNum w:abstractNumId="9" w15:restartNumberingAfterBreak="0">
     <w:nsid w:val="7B3B65DF"/>
     <w:multiLevelType w:val="hybridMultilevel"/>
     <w:tmpl w:val="F02C62CE"/>
@@ -1921,28 +3067,34 @@
     </w:lvl>
   </w:abstractNum>
   <w:num w:numId="1" w16cid:durableId="972828647">
+    <w:abstractNumId w:val="5"/>
+  </w:num>
+  <w:num w:numId="2" w16cid:durableId="92746444">
+    <w:abstractNumId w:val="9"/>
+  </w:num>
+  <w:num w:numId="3" w16cid:durableId="719205662">
+    <w:abstractNumId w:val="8"/>
+  </w:num>
+  <w:num w:numId="4" w16cid:durableId="638077612">
     <w:abstractNumId w:val="4"/>
   </w:num>
-  <w:num w:numId="2" w16cid:durableId="92746444">
+  <w:num w:numId="5" w16cid:durableId="1907954496">
+    <w:abstractNumId w:val="2"/>
+  </w:num>
+  <w:num w:numId="6" w16cid:durableId="729812645">
     <w:abstractNumId w:val="7"/>
   </w:num>
-  <w:num w:numId="3" w16cid:durableId="719205662">
+  <w:num w:numId="7" w16cid:durableId="1401249843">
+    <w:abstractNumId w:val="1"/>
+  </w:num>
+  <w:num w:numId="8" w16cid:durableId="44262820">
+    <w:abstractNumId w:val="3"/>
+  </w:num>
+  <w:num w:numId="9" w16cid:durableId="511459625">
     <w:abstractNumId w:val="6"/>
   </w:num>
-  <w:num w:numId="4" w16cid:durableId="638077612">
-    <w:abstractNumId w:val="3"/>
-  </w:num>
-  <w:num w:numId="5" w16cid:durableId="1907954496">
-    <w:abstractNumId w:val="1"/>
-  </w:num>
-  <w:num w:numId="6" w16cid:durableId="729812645">
-    <w:abstractNumId w:val="5"/>
-  </w:num>
-  <w:num w:numId="7" w16cid:durableId="1401249843">
+  <w:num w:numId="10" w16cid:durableId="1616907017">
     <w:abstractNumId w:val="0"/>
-  </w:num>
-  <w:num w:numId="8" w16cid:durableId="44262820">
-    <w:abstractNumId w:val="2"/>
   </w:num>
 </w:numbering>
 </file>
@@ -2347,7 +3499,7 @@
   <w:style w:type="paragraph" w:default="1" w:styleId="Normal">
     <w:name w:val="Normal"/>
     <w:qFormat/>
-    <w:rsid w:val="0080340A"/>
+    <w:rsid w:val="00A73BC0"/>
   </w:style>
   <w:style w:type="paragraph" w:styleId="Ttulo1">
     <w:name w:val="heading 1"/>

</xml_diff>

<commit_message>
Solamente se agrega el nombre de los autores
</commit_message>
<xml_diff>
--- a/Informe preliminar.docx
+++ b/Informe preliminar.docx
@@ -4,6 +4,41 @@
   <w:body>
     <w:p>
       <w:pPr>
+        <w:rPr>
+          <w:rFonts w:ascii="Times New Roman" w:hAnsi="Times New Roman" w:cs="Times New Roman"/>
+          <w:sz w:val="24"/>
+          <w:szCs w:val="24"/>
+        </w:rPr>
+      </w:pPr>
+      <w:r>
+        <w:rPr>
+          <w:rFonts w:ascii="Times New Roman" w:hAnsi="Times New Roman" w:cs="Times New Roman"/>
+          <w:b/>
+          <w:bCs/>
+          <w:sz w:val="24"/>
+          <w:szCs w:val="24"/>
+        </w:rPr>
+        <w:t>Autores:</w:t>
+      </w:r>
+      <w:r>
+        <w:rPr>
+          <w:rFonts w:ascii="Times New Roman" w:hAnsi="Times New Roman" w:cs="Times New Roman"/>
+          <w:sz w:val="24"/>
+          <w:szCs w:val="24"/>
+        </w:rPr>
+        <w:t xml:space="preserve"> </w:t>
+      </w:r>
+      <w:r>
+        <w:rPr>
+          <w:rFonts w:ascii="Times New Roman" w:hAnsi="Times New Roman" w:cs="Times New Roman"/>
+          <w:sz w:val="24"/>
+          <w:szCs w:val="24"/>
+        </w:rPr>
+        <w:t>Andres Guerrero, Mauricio Reyes</w:t>
+      </w:r>
+    </w:p>
+    <w:p>
+      <w:pPr>
         <w:jc w:val="center"/>
         <w:rPr>
           <w:rFonts w:ascii="Times New Roman" w:hAnsi="Times New Roman" w:cs="Times New Roman"/>
@@ -33,18 +68,6 @@
         </w:rPr>
         <w:t xml:space="preserve"> Preliminar</w:t>
       </w:r>
-    </w:p>
-    <w:p>
-      <w:pPr>
-        <w:jc w:val="center"/>
-        <w:rPr>
-          <w:rFonts w:ascii="Times New Roman" w:hAnsi="Times New Roman" w:cs="Times New Roman"/>
-          <w:b/>
-          <w:bCs/>
-          <w:sz w:val="24"/>
-          <w:szCs w:val="24"/>
-        </w:rPr>
-      </w:pPr>
     </w:p>
     <w:p>
       <w:pPr>
@@ -3703,6 +3726,7 @@
   <w:style w:type="character" w:default="1" w:styleId="Fuentedeprrafopredeter">
     <w:name w:val="Default Paragraph Font"/>
     <w:uiPriority w:val="1"/>
+    <w:semiHidden/>
     <w:unhideWhenUsed/>
   </w:style>
   <w:style w:type="table" w:default="1" w:styleId="Tablanormal">

</xml_diff>